<commit_message>
Moving changes from sb repo to this repo
</commit_message>
<xml_diff>
--- a/a2wp-documentation.docx
+++ b/a2wp-documentation.docx
@@ -189,12 +189,6 @@
             <w:r>
               <w:t>3</w:t>
             </w:r>
-            <w:r>
-              <w:t>-</w:t>
-            </w:r>
-            <w:r>
-              <w:t>4</w:t>
-            </w:r>
           </w:p>
         </w:tc>
       </w:tr>
@@ -232,41 +226,8 @@
               <w:t xml:space="preserve">p. </w:t>
             </w:r>
             <w:r>
-              <w:t>5</w:t>
+              <w:t>3</w:t>
             </w:r>
-          </w:p>
-        </w:tc>
-      </w:tr>
-      <w:tr>
-        <w:trPr>
-          <w:trHeight w:val="432"/>
-        </w:trPr>
-        <w:tc>
-          <w:tcPr>
-            <w:tcW w:w="4723" w:type="dxa"/>
-          </w:tcPr>
-          <w:p>
-            <w:pPr>
-              <w:jc w:val="both"/>
-            </w:pPr>
-            <w:hyperlink w:anchor="Proxies" w:history="1">
-              <w:r>
-                <w:rPr>
-                  <w:rStyle w:val="Hyperlink"/>
-                </w:rPr>
-                <w:t>Proxies</w:t>
-              </w:r>
-            </w:hyperlink>
-          </w:p>
-        </w:tc>
-        <w:tc>
-          <w:tcPr>
-            <w:tcW w:w="1127" w:type="dxa"/>
-          </w:tcPr>
-          <w:p>
-            <w:pPr>
-              <w:jc w:val="both"/>
-            </w:pPr>
           </w:p>
         </w:tc>
       </w:tr>
@@ -303,6 +264,9 @@
             <w:r>
               <w:t xml:space="preserve">p. </w:t>
             </w:r>
+            <w:r>
+              <w:t>4-6</w:t>
+            </w:r>
           </w:p>
         </w:tc>
       </w:tr>
@@ -319,6 +283,7 @@
     <w:p/>
     <w:p/>
     <w:p/>
+    <w:p/>
     <w:p>
       <w:pPr>
         <w:rPr>
@@ -359,20 +324,90 @@
         </w:r>
       </w:hyperlink>
       <w:r>
-        <w:t>), format the results, and push the product to SBVPA’s WordPress site.</w:t>
-      </w:r>
-      <w:r>
-        <w:t xml:space="preserve"> Currently</w:t>
-      </w:r>
-      <w:r>
-        <w:t xml:space="preserve">, A2WP accomplishes two functions: it creates new activity posts for each activity added to Amilia, </w:t>
-      </w:r>
-      <w:r>
-        <w:t xml:space="preserve">and it updates activity info when someone loads </w:t>
-      </w:r>
-      <w:r>
-        <w:t>its respective webpage</w:t>
-      </w:r>
+        <w:t>)</w:t>
+      </w:r>
+      <w:r>
+        <w:t>, format the results, and push the product to</w:t>
+      </w:r>
+      <w:r>
+        <w:t xml:space="preserve"> SB websites</w:t>
+      </w:r>
+      <w:r>
+        <w:t>.</w:t>
+      </w:r>
+      <w:r>
+        <w:t xml:space="preserve"> </w:t>
+      </w:r>
+    </w:p>
+    <w:p>
+      <w:r>
+        <w:t xml:space="preserve">Within its Azure project, two functions call the class: </w:t>
+      </w:r>
+      <w:r>
+        <w:rPr>
+          <w:b/>
+          <w:bCs/>
+        </w:rPr>
+        <w:t>C</w:t>
+      </w:r>
+      <w:r>
+        <w:rPr>
+          <w:b/>
+          <w:bCs/>
+        </w:rPr>
+        <w:t>reateA2WP</w:t>
+      </w:r>
+      <w:r>
+        <w:t xml:space="preserve"> and </w:t>
+      </w:r>
+      <w:r>
+        <w:rPr>
+          <w:b/>
+          <w:bCs/>
+        </w:rPr>
+        <w:t>U</w:t>
+      </w:r>
+      <w:r>
+        <w:rPr>
+          <w:b/>
+          <w:bCs/>
+        </w:rPr>
+        <w:t>pdateA2WP</w:t>
+      </w:r>
+      <w:r>
+        <w:t xml:space="preserve">. </w:t>
+      </w:r>
+      <w:r>
+        <w:t>C</w:t>
+      </w:r>
+      <w:r>
+        <w:t xml:space="preserve">reateA2WP runs on a timer and grabs all Amilia and WordPress data for the purpose of comparing them; </w:t>
+      </w:r>
+      <w:r>
+        <w:t>U</w:t>
+      </w:r>
+      <w:r>
+        <w:t xml:space="preserve">pdateA2WP runs on an HTTP trigger and grabs the data of one specific Amilia/WordPress post. </w:t>
+      </w:r>
+    </w:p>
+    <w:p>
+      <w:r>
+        <w:rPr>
+          <w:u w:val="single"/>
+        </w:rPr>
+        <w:t>If you want to set up A2WP to a new site</w:t>
+      </w:r>
+      <w:r>
+        <w:t xml:space="preserve">, first follow the steps in the </w:t>
+      </w:r>
+      <w:hyperlink r:id="rId8" w:history="1">
+        <w:r>
+          <w:rPr>
+            <w:rStyle w:val="Hyperlink"/>
+          </w:rPr>
+          <w:t>GitHub readme</w:t>
+        </w:r>
+      </w:hyperlink>
       <w:r>
         <w:t xml:space="preserve">. </w:t>
       </w:r>
@@ -415,28 +450,370 @@
         <w:t xml:space="preserve"> OVERVIEW</w:t>
       </w:r>
     </w:p>
-    <w:bookmarkEnd w:id="1"/>
-    <w:p>
-      <w:r>
-        <w:t xml:space="preserve">A2WP is split into two files: a2wp.js and call-a2wp.js. The first file defines the class, and the second file makes the objects. </w:t>
+    <w:p>
+      <w:r>
+        <w:t>A2WP is a class declared in site &gt; wwwroot &gt; A2WP &gt; a2wp.js</w:t>
+      </w:r>
+    </w:p>
+    <w:p>
+      <w:r>
+        <w:t>You may see other files in the A2WP directory, like sbvpa-a2wp</w:t>
+      </w:r>
+      <w:r>
+        <w:t>.js</w:t>
+      </w:r>
+      <w:r>
+        <w:t xml:space="preserve"> and dreamcenter-a2wp</w:t>
+      </w:r>
+      <w:r>
+        <w:t>.js</w:t>
+      </w:r>
+      <w:r>
+        <w:t xml:space="preserve">. These scripts build out A2WP objects and give them custom functionality. </w:t>
+      </w:r>
+    </w:p>
+    <w:p>
+      <w:r>
+        <w:t xml:space="preserve">To make your own object, you should make a separate file like the two I just mentioned. </w:t>
       </w:r>
       <w:r>
         <w:rPr>
           <w:u w:val="single"/>
         </w:rPr>
-        <w:t xml:space="preserve">You should hopefully only need to ever work with call-a2wp.js </w:t>
-      </w:r>
-      <w:r>
-        <w:t xml:space="preserve">when building out new functionality, but just in case – here’s a brief description of each function within the </w:t>
-      </w:r>
-      <w:r>
-        <w:t>A2WP</w:t>
-      </w:r>
-      <w:r>
-        <w:t xml:space="preserve"> class. </w:t>
-      </w:r>
-    </w:p>
-    <w:p/>
+        <w:t xml:space="preserve">You’ll hopefully never need to edit a2wp.js, </w:t>
+      </w:r>
+      <w:r>
+        <w:t>but just in case – here’s a brief description of</w:t>
+      </w:r>
+      <w:r>
+        <w:t xml:space="preserve"> the class’s main functions</w:t>
+      </w:r>
+      <w:r>
+        <w:t xml:space="preserve">. </w:t>
+      </w:r>
+      <w:bookmarkEnd w:id="1"/>
+    </w:p>
+    <w:tbl>
+      <w:tblPr>
+        <w:tblStyle w:val="TableGrid"/>
+        <w:tblW w:w="0" w:type="auto"/>
+        <w:tblLook w:val="04A0" w:firstRow="1" w:lastRow="0" w:firstColumn="1" w:lastColumn="0" w:noHBand="0" w:noVBand="1"/>
+      </w:tblPr>
+      <w:tblGrid>
+        <w:gridCol w:w="3055"/>
+        <w:gridCol w:w="6295"/>
+      </w:tblGrid>
+      <w:tr>
+        <w:tc>
+          <w:tcPr>
+            <w:tcW w:w="3055" w:type="dxa"/>
+          </w:tcPr>
+          <w:p>
+            <w:pPr>
+              <w:rPr>
+                <w:b/>
+                <w:bCs/>
+              </w:rPr>
+            </w:pPr>
+            <w:r>
+              <w:rPr>
+                <w:b/>
+                <w:bCs/>
+              </w:rPr>
+              <w:t>fetchData</w:t>
+            </w:r>
+          </w:p>
+        </w:tc>
+        <w:tc>
+          <w:tcPr>
+            <w:tcW w:w="6295" w:type="dxa"/>
+          </w:tcPr>
+          <w:p>
+            <w:r>
+              <w:t xml:space="preserve">Fetches data from </w:t>
+            </w:r>
+            <w:r>
+              <w:t>Amilia backend and from the specified WP site</w:t>
+            </w:r>
+            <w:r>
+              <w:t xml:space="preserve">. </w:t>
+            </w:r>
+            <w:r>
+              <w:t>If the result returns multiple pages, fetchData collects the header’s pagination info and sends it to fetchMorePages.</w:t>
+            </w:r>
+          </w:p>
+        </w:tc>
+      </w:tr>
+      <w:tr>
+        <w:tc>
+          <w:tcPr>
+            <w:tcW w:w="3055" w:type="dxa"/>
+          </w:tcPr>
+          <w:p>
+            <w:pPr>
+              <w:rPr>
+                <w:b/>
+                <w:bCs/>
+              </w:rPr>
+            </w:pPr>
+            <w:r>
+              <w:rPr>
+                <w:b/>
+                <w:bCs/>
+              </w:rPr>
+              <w:t>postData</w:t>
+            </w:r>
+          </w:p>
+        </w:tc>
+        <w:tc>
+          <w:tcPr>
+            <w:tcW w:w="6295" w:type="dxa"/>
+          </w:tcPr>
+          <w:p>
+            <w:r>
+              <w:t>Pushes data to the specified URL + endpoint. All this data first needs to be stored in the bodyData parameter as a JSON object.</w:t>
+            </w:r>
+          </w:p>
+        </w:tc>
+      </w:tr>
+      <w:tr>
+        <w:tc>
+          <w:tcPr>
+            <w:tcW w:w="3055" w:type="dxa"/>
+          </w:tcPr>
+          <w:p>
+            <w:pPr>
+              <w:rPr>
+                <w:b/>
+                <w:bCs/>
+              </w:rPr>
+            </w:pPr>
+            <w:r>
+              <w:rPr>
+                <w:b/>
+                <w:bCs/>
+              </w:rPr>
+              <w:t>delete</w:t>
+            </w:r>
+          </w:p>
+        </w:tc>
+        <w:tc>
+          <w:tcPr>
+            <w:tcW w:w="6295" w:type="dxa"/>
+          </w:tcPr>
+          <w:p>
+            <w:r>
+              <w:t xml:space="preserve">Takes a URL that has an endpoint + post id and deletes that post. Will also delete the post’s attached thumbnail to reduce the amount of unparented images in WP’s media folder. </w:t>
+            </w:r>
+          </w:p>
+        </w:tc>
+      </w:tr>
+      <w:tr>
+        <w:tc>
+          <w:tcPr>
+            <w:tcW w:w="3055" w:type="dxa"/>
+          </w:tcPr>
+          <w:p>
+            <w:pPr>
+              <w:rPr>
+                <w:b/>
+                <w:bCs/>
+              </w:rPr>
+            </w:pPr>
+            <w:r>
+              <w:rPr>
+                <w:b/>
+                <w:bCs/>
+              </w:rPr>
+              <w:t>checkExists</w:t>
+            </w:r>
+          </w:p>
+        </w:tc>
+        <w:tc>
+          <w:tcPr>
+            <w:tcW w:w="6295" w:type="dxa"/>
+          </w:tcPr>
+          <w:p>
+            <w:r>
+              <w:t xml:space="preserve">If running </w:t>
+            </w:r>
+            <w:r>
+              <w:t>C</w:t>
+            </w:r>
+            <w:r>
+              <w:t>reateA2WP, checkExists compares all available Amilia data with all current WP posts and sees 1) if Amilia has any new posts WP needs to add, and 2) if WP has any old posts that no longer exist on Amilia.</w:t>
+            </w:r>
+          </w:p>
+        </w:tc>
+      </w:tr>
+      <w:tr>
+        <w:tc>
+          <w:tcPr>
+            <w:tcW w:w="3055" w:type="dxa"/>
+          </w:tcPr>
+          <w:p>
+            <w:pPr>
+              <w:rPr>
+                <w:b/>
+                <w:bCs/>
+              </w:rPr>
+            </w:pPr>
+            <w:r>
+              <w:rPr>
+                <w:b/>
+                <w:bCs/>
+              </w:rPr>
+              <w:t>call</w:t>
+            </w:r>
+          </w:p>
+        </w:tc>
+        <w:tc>
+          <w:tcPr>
+            <w:tcW w:w="6295" w:type="dxa"/>
+          </w:tcPr>
+          <w:p>
+            <w:r>
+              <w:t xml:space="preserve">Runs fetchData, checkExists (if necessary), and passes data through custom functions. The custom functions will </w:t>
+            </w:r>
+            <w:r>
+              <w:lastRenderedPageBreak/>
+              <w:t>create an objPost and objDel: call then posts everything in objPost and deletes everything in objDel.</w:t>
+            </w:r>
+          </w:p>
+        </w:tc>
+      </w:tr>
+    </w:tbl>
+    <w:p>
+      <w:pPr>
+        <w:pBdr>
+          <w:bottom w:val="single" w:sz="4" w:space="1" w:color="auto"/>
+        </w:pBdr>
+        <w:rPr>
+          <w:b/>
+          <w:bCs/>
+        </w:rPr>
+      </w:pPr>
+      <w:bookmarkStart w:id="2" w:name="Authorization"/>
+    </w:p>
+    <w:p>
+      <w:pPr>
+        <w:rPr>
+          <w:b/>
+          <w:bCs/>
+        </w:rPr>
+      </w:pPr>
+    </w:p>
+    <w:p>
+      <w:pPr>
+        <w:rPr>
+          <w:b/>
+          <w:bCs/>
+        </w:rPr>
+      </w:pPr>
+      <w:r>
+        <w:rPr>
+          <w:b/>
+          <w:bCs/>
+        </w:rPr>
+        <w:t>AUTHORIZATION</w:t>
+      </w:r>
+    </w:p>
+    <w:bookmarkEnd w:id="2"/>
+    <w:p>
+      <w:r>
+        <w:t xml:space="preserve">A2WP needs authorization for both Amilia and WordPress. </w:t>
+      </w:r>
+      <w:r>
+        <w:t xml:space="preserve">All passwords and tokens exist in the Azure project &gt; Settings &gt; Environment variables. </w:t>
+      </w:r>
+    </w:p>
+    <w:p>
+      <w:r>
+        <w:t xml:space="preserve">To grab Amilia events, A2WP uses the </w:t>
+      </w:r>
+      <w:r>
+        <w:t xml:space="preserve">bearer token AUTH_TOKEN. </w:t>
+      </w:r>
+    </w:p>
+    <w:p>
+      <w:r>
+        <w:t>CreateA2WP</w:t>
+      </w:r>
+      <w:r>
+        <w:t xml:space="preserve"> and </w:t>
+      </w:r>
+      <w:r>
+        <w:t>UpdateA2WP</w:t>
+      </w:r>
+      <w:r>
+        <w:t xml:space="preserve"> </w:t>
+      </w:r>
+      <w:r>
+        <w:t xml:space="preserve">use WP Application Passwords to push changes to WP. The two Application Passwords that the API currently use are SBVPA_PASS and DREAMCENTER_PASS. </w:t>
+      </w:r>
+    </w:p>
+    <w:p>
+      <w:r>
+        <w:t>To generate an Application Password, go the appsadmin account on your WP site, go to profile, and scroll all the way down. It should have the option to generate a password – if not, Wordfence may have disabled that feature by default.</w:t>
+      </w:r>
+    </w:p>
+    <w:p>
+      <w:pPr>
+        <w:pBdr>
+          <w:bottom w:val="single" w:sz="4" w:space="1" w:color="auto"/>
+        </w:pBdr>
+      </w:pPr>
+    </w:p>
+    <w:p>
+      <w:bookmarkStart w:id="3" w:name="Endpoints"/>
+    </w:p>
+    <w:p>
+      <w:pPr>
+        <w:rPr>
+          <w:b/>
+          <w:bCs/>
+        </w:rPr>
+      </w:pPr>
+      <w:r>
+        <w:rPr>
+          <w:b/>
+          <w:bCs/>
+        </w:rPr>
+        <w:t>ENDPOINTS AND URLS</w:t>
+      </w:r>
+    </w:p>
+    <w:p>
+      <w:hyperlink r:id="rId9" w:history="1">
+        <w:r>
+          <w:rPr>
+            <w:rStyle w:val="Hyperlink"/>
+          </w:rPr>
+          <w:t>https://a2wp.azurewebsites.net/api/UpdateA2WP</w:t>
+        </w:r>
+      </w:hyperlink>
+      <w:r>
+        <w:t xml:space="preserve"> </w:t>
+      </w:r>
+    </w:p>
+    <w:p>
+      <w:hyperlink r:id="rId10" w:history="1">
+        <w:r>
+          <w:rPr>
+            <w:rStyle w:val="Hyperlink"/>
+          </w:rPr>
+          <w:t>https://app.amilia.com/api/V3/en/org/sbvpa</w:t>
+        </w:r>
+        <w:r>
+          <w:rPr>
+            <w:rStyle w:val="Hyperlink"/>
+          </w:rPr>
+          <w:t>/</w:t>
+        </w:r>
+      </w:hyperlink>
+      <w:r>
+        <w:t xml:space="preserve"> </w:t>
+      </w:r>
+    </w:p>
     <w:p>
       <w:pPr>
         <w:pBdr>
@@ -445,17 +822,9 @@
           <w:bottom w:val="single" w:sz="4" w:space="1" w:color="auto"/>
           <w:right w:val="single" w:sz="4" w:space="4" w:color="auto"/>
         </w:pBdr>
-        <w:rPr>
-          <w:b/>
-          <w:bCs/>
-        </w:rPr>
-      </w:pPr>
-      <w:r>
-        <w:rPr>
-          <w:b/>
-          <w:bCs/>
-        </w:rPr>
-        <w:t>checkRun</w:t>
+      </w:pPr>
+      <w:r>
+        <w:t>SBVPA</w:t>
       </w:r>
     </w:p>
     <w:p>
@@ -467,12 +836,14 @@
           <w:right w:val="single" w:sz="4" w:space="4" w:color="auto"/>
         </w:pBdr>
       </w:pPr>
-      <w:r>
-        <w:t xml:space="preserve">checkRun holds an array “check” with two bools: </w:t>
-      </w:r>
-      <w:r>
-        <w:t xml:space="preserve">one determines if the current parent path matches the target parent path, and the other determines if the current child matches the target child. </w:t>
-      </w:r>
+      <w:hyperlink r:id="rId11" w:history="1">
+        <w:r>
+          <w:rPr>
+            <w:rStyle w:val="Hyperlink"/>
+          </w:rPr>
+          <w:t>https://sbvpa.org/wp-json/wp/v2/</w:t>
+        </w:r>
+      </w:hyperlink>
     </w:p>
     <w:p>
       <w:pPr>
@@ -484,7 +855,10 @@
         </w:pBdr>
       </w:pPr>
       <w:r>
-        <w:t xml:space="preserve">Take this example URL: </w:t>
+        <w:t>GET endpoints: activities?</w:t>
+      </w:r>
+      <w:r>
+        <w:t>amilia_id&amp;status=publish&amp;per_page=100</w:t>
       </w:r>
     </w:p>
     <w:p>
@@ -497,8 +871,13 @@
         </w:pBdr>
       </w:pPr>
       <w:r>
-        <w:t>https://sbvpastg.wpenginepowered.com/things-to-do/activity-5927158/</w:t>
-      </w:r>
+        <w:t>POST endpoints: activities, activities/{id}, media</w:t>
+      </w:r>
+    </w:p>
+    <w:p>
+      <w:pPr>
+        <w:spacing w:after="0"/>
+      </w:pPr>
     </w:p>
     <w:p>
       <w:pPr>
@@ -510,35 +889,7 @@
         </w:pBdr>
       </w:pPr>
       <w:r>
-        <w:t>The</w:t>
-      </w:r>
-      <w:r>
-        <w:t xml:space="preserve"> child would be the last slug in the url (/activity-</w:t>
-      </w:r>
-      <w:r>
-        <w:t>5927158/</w:t>
-      </w:r>
-      <w:r>
-        <w:t>) and the parent would be the pathname sans the child (/things-to-do/). The current and target parent</w:t>
-      </w:r>
-      <w:r>
-        <w:t>s</w:t>
-      </w:r>
-      <w:r>
-        <w:t xml:space="preserve"> are directly compared, while the current and target </w:t>
-      </w:r>
-      <w:r>
-        <w:t xml:space="preserve">children are not – the script only needs to know if the child exists and whether or not the script </w:t>
-      </w:r>
-      <w:r>
-        <w:rPr>
-          <w:i/>
-          <w:iCs/>
-        </w:rPr>
-        <w:t>expects</w:t>
-      </w:r>
-      <w:r>
-        <w:t xml:space="preserve"> one to exist. </w:t>
+        <w:t>DREAMCENTER</w:t>
       </w:r>
     </w:p>
     <w:p>
@@ -550,17 +901,17 @@
           <w:right w:val="single" w:sz="4" w:space="4" w:color="auto"/>
         </w:pBdr>
       </w:pPr>
-      <w:r>
-        <w:t xml:space="preserve">Both bools in the check array must be true for the script to progress. </w:t>
-      </w:r>
-    </w:p>
-    <w:p>
-      <w:pPr>
-        <w:rPr>
-          <w:b/>
-          <w:bCs/>
-        </w:rPr>
-      </w:pPr>
+      <w:hyperlink r:id="rId12" w:history="1">
+        <w:r>
+          <w:rPr>
+            <w:rStyle w:val="Hyperlink"/>
+          </w:rPr>
+          <w:t>https://dreamcente2dev.wpenginepowered.com/wp-json/wp/v2/</w:t>
+        </w:r>
+      </w:hyperlink>
+      <w:r>
+        <w:t xml:space="preserve"> </w:t>
+      </w:r>
     </w:p>
     <w:p>
       <w:pPr>
@@ -570,17 +921,12 @@
           <w:bottom w:val="single" w:sz="4" w:space="1" w:color="auto"/>
           <w:right w:val="single" w:sz="4" w:space="4" w:color="auto"/>
         </w:pBdr>
-        <w:rPr>
-          <w:b/>
-          <w:bCs/>
-        </w:rPr>
-      </w:pPr>
-      <w:r>
-        <w:rPr>
-          <w:b/>
-          <w:bCs/>
-        </w:rPr>
-        <w:t>fetchData</w:t>
+      </w:pPr>
+      <w:r>
+        <w:t>GET endpoints: events?</w:t>
+      </w:r>
+      <w:r>
+        <w:t>amilia_id&amp;status=publish&amp;per_page=100</w:t>
       </w:r>
     </w:p>
     <w:p>
@@ -593,23 +939,10 @@
         </w:pBdr>
       </w:pPr>
       <w:r>
-        <w:t xml:space="preserve">fetchData grabs data from whatever URL specified. The method </w:t>
-      </w:r>
-      <w:r>
-        <w:t xml:space="preserve">will be passed by call() because, </w:t>
-      </w:r>
-      <w:r>
-        <w:t>while GET is usually used, the</w:t>
-      </w:r>
-      <w:r>
-        <w:t xml:space="preserve"> GetAmilia</w:t>
-      </w:r>
-      <w:r>
-        <w:t xml:space="preserve"> proxy requires POST. </w:t>
-      </w:r>
-      <w:r>
-        <w:t xml:space="preserve"> </w:t>
-      </w:r>
+        <w:t>POST endpoints: activities, activities/{id}, media</w:t>
+      </w:r>
+      <w:bookmarkStart w:id="4" w:name="CustomFunctions"/>
+      <w:bookmarkEnd w:id="3"/>
     </w:p>
     <w:p>
       <w:pPr>
@@ -618,232 +951,105 @@
           <w:bCs/>
         </w:rPr>
       </w:pPr>
-    </w:p>
-    <w:p>
-      <w:pPr>
-        <w:pBdr>
-          <w:top w:val="single" w:sz="4" w:space="1" w:color="auto"/>
-          <w:left w:val="single" w:sz="4" w:space="4" w:color="auto"/>
-          <w:bottom w:val="single" w:sz="4" w:space="1" w:color="auto"/>
-          <w:right w:val="single" w:sz="4" w:space="4" w:color="auto"/>
-        </w:pBdr>
+      <w:r>
         <w:rPr>
           <w:b/>
           <w:bCs/>
         </w:rPr>
-      </w:pPr>
-      <w:r>
+        <w:lastRenderedPageBreak/>
+        <w:t>ADDING CUSTOM FUNCTIONS</w:t>
+      </w:r>
+    </w:p>
+    <w:p>
+      <w:r>
+        <w:t xml:space="preserve">The purpose of custom functions </w:t>
+      </w:r>
+      <w:r>
+        <w:t>is</w:t>
+      </w:r>
+      <w:r>
+        <w:t xml:space="preserve"> to manipulate Amilia data </w:t>
+      </w:r>
+      <w:r>
+        <w:t xml:space="preserve">into something viable for posting to WP. Each function must first be declared and then assigned to your A2WP instance; </w:t>
+      </w:r>
+      <w:r>
+        <w:rPr>
+          <w:u w:val="single"/>
+        </w:rPr>
+        <w:t xml:space="preserve">the functions execute in the order they are assigned. </w:t>
+      </w:r>
+    </w:p>
+    <w:p>
+      <w:r>
+        <w:t xml:space="preserve">To create your own instance and functions, enter the </w:t>
+      </w:r>
+      <w:hyperlink r:id="rId13" w:anchor="@southbendin2.onmicrosoft.com/resource/subscriptions/1e53e397-32bd-4d3a-80d2-c3823b6a084d/resourceGroups/a2wp_group/providers/Microsoft.Web/sites/a2wp/appServices" w:history="1">
+        <w:r>
+          <w:rPr>
+            <w:rStyle w:val="Hyperlink"/>
+          </w:rPr>
+          <w:t>Azure project</w:t>
+        </w:r>
+      </w:hyperlink>
+      <w:r>
+        <w:t xml:space="preserve"> and make your way to the Kudu </w:t>
+      </w:r>
+      <w:r>
+        <w:t>Services</w:t>
+      </w:r>
+      <w:r>
+        <w:t xml:space="preserve"> from the left menu. </w:t>
+      </w:r>
+    </w:p>
+    <w:p>
+      <w:r>
+        <w:t xml:space="preserve">Development Tools &gt; Advanced Tools &gt; Go </w:t>
+      </w:r>
+      <w:r>
+        <w:t>&gt; Debug console</w:t>
+      </w:r>
+    </w:p>
+    <w:p>
+      <w:pPr>
         <w:rPr>
           <w:b/>
           <w:bCs/>
         </w:rPr>
-        <w:lastRenderedPageBreak/>
-        <w:t>postData</w:t>
-      </w:r>
-    </w:p>
-    <w:p>
-      <w:pPr>
-        <w:pBdr>
-          <w:top w:val="single" w:sz="4" w:space="1" w:color="auto"/>
-          <w:left w:val="single" w:sz="4" w:space="4" w:color="auto"/>
-          <w:bottom w:val="single" w:sz="4" w:space="1" w:color="auto"/>
-          <w:right w:val="single" w:sz="4" w:space="4" w:color="auto"/>
-        </w:pBdr>
-      </w:pPr>
-      <w:r>
-        <w:t>postData pushes data to the specified url and endpoint</w:t>
-      </w:r>
-      <w:r>
-        <w:t xml:space="preserve">. All pushed data will be stored in the bodyData parameter.  </w:t>
-      </w:r>
-    </w:p>
-    <w:p>
-      <w:pPr>
+      </w:pPr>
+      <w:r>
+        <w:t xml:space="preserve">Now that you’re in the file explorer, go to site &gt; wwwroot &gt; A2WP and hit the plus beside the A2WP to make a new file, which you’ll name </w:t>
+      </w:r>
+      <w:r>
         <w:rPr>
           <w:b/>
           <w:bCs/>
         </w:rPr>
-      </w:pPr>
-    </w:p>
-    <w:p>
-      <w:pPr>
-        <w:pBdr>
-          <w:top w:val="single" w:sz="4" w:space="1" w:color="auto"/>
-          <w:left w:val="single" w:sz="4" w:space="4" w:color="auto"/>
-          <w:bottom w:val="single" w:sz="4" w:space="1" w:color="auto"/>
-          <w:right w:val="single" w:sz="4" w:space="4" w:color="auto"/>
-        </w:pBdr>
-        <w:rPr>
-          <w:b/>
-          <w:bCs/>
-        </w:rPr>
-      </w:pPr>
-      <w:r>
-        <w:rPr>
-          <w:b/>
-          <w:bCs/>
-        </w:rPr>
-        <w:t xml:space="preserve">call </w:t>
-      </w:r>
-    </w:p>
-    <w:p>
-      <w:pPr>
-        <w:pBdr>
-          <w:top w:val="single" w:sz="4" w:space="1" w:color="auto"/>
-          <w:left w:val="single" w:sz="4" w:space="4" w:color="auto"/>
-          <w:bottom w:val="single" w:sz="4" w:space="1" w:color="auto"/>
-          <w:right w:val="single" w:sz="4" w:space="4" w:color="auto"/>
-        </w:pBdr>
-      </w:pPr>
-      <w:r>
-        <w:t xml:space="preserve">call runs all of the above functions. If checkRun and fetchTemplate return true, call fetches the </w:t>
-      </w:r>
-      <w:r>
-        <w:t xml:space="preserve">Amilia and WP data and then passes it into a loop where each custom function runs. This loop generates JSON with all the new data needed to create WP posts, and call then iterates through the JSON and runs postData for each item. </w:t>
-      </w:r>
-    </w:p>
-    <w:p>
-      <w:pPr>
-        <w:pBdr>
-          <w:bottom w:val="single" w:sz="4" w:space="1" w:color="auto"/>
-        </w:pBdr>
-      </w:pPr>
-    </w:p>
-    <w:p/>
-    <w:p>
-      <w:pPr>
-        <w:rPr>
-          <w:b/>
-          <w:bCs/>
-        </w:rPr>
-      </w:pPr>
-      <w:bookmarkStart w:id="2" w:name="Authorization"/>
-      <w:r>
-        <w:rPr>
-          <w:b/>
-          <w:bCs/>
-        </w:rPr>
-        <w:t>AUTHORIZATION</w:t>
-      </w:r>
-    </w:p>
-    <w:bookmarkEnd w:id="2"/>
-    <w:p>
-      <w:r>
-        <w:t xml:space="preserve">A2WP needs authorization for both Amilia and WordPress. </w:t>
-      </w:r>
-    </w:p>
-    <w:p>
-      <w:r>
-        <w:t>Amilia’s authorization header and bearer token automatically generate through the URL A2WP currently uses</w:t>
-      </w:r>
-      <w:r>
-        <w:t xml:space="preserve">. The GetAmilia proxy uses a WP application password. </w:t>
-      </w:r>
-    </w:p>
-    <w:p>
-      <w:r>
-        <w:t xml:space="preserve">The script connects to WordPress by passing the X-WP-Nonce header and grabbing a nonce value that WordPress creates within it’s functions.php file. A2WP </w:t>
-      </w:r>
-      <w:r>
-        <w:t xml:space="preserve">can </w:t>
-      </w:r>
-      <w:r>
-        <w:t xml:space="preserve">read the value because, when initializing </w:t>
-      </w:r>
-      <w:r>
-        <w:t>amilia_to_wordpress(), it localizes a CDATA array</w:t>
-      </w:r>
-      <w:r>
-        <w:t xml:space="preserve"> (apiData)</w:t>
-      </w:r>
-      <w:r>
-        <w:t xml:space="preserve"> with the nonce inside. </w:t>
-      </w:r>
-    </w:p>
-    <w:p>
-      <w:r>
-        <w:t>Here is the path to functions.php (in WP File Manager): wp-content/themes/sbvpa/functions.php</w:t>
-      </w:r>
-    </w:p>
-    <w:p>
-      <w:r>
-        <w:t>WP File Manager</w:t>
-      </w:r>
-    </w:p>
+        <w:t>(site name)-a2wp.js</w:t>
+      </w:r>
+    </w:p>
+    <w:p>
+      <w:r>
+        <w:t>Here are some example</w:t>
+      </w:r>
+      <w:r>
+        <w:t xml:space="preserve">s </w:t>
+      </w:r>
+      <w:r>
+        <w:t xml:space="preserve">of what should be in this file: </w:t>
+      </w:r>
+    </w:p>
+    <w:bookmarkEnd w:id="4"/>
     <w:p>
       <w:r>
         <w:rPr>
           <w:noProof/>
         </w:rPr>
-        <mc:AlternateContent>
-          <mc:Choice Requires="wpi">
-            <w:drawing>
-              <wp:anchor distT="0" distB="0" distL="114300" distR="114300" simplePos="0" relativeHeight="251660288" behindDoc="0" locked="0" layoutInCell="1" allowOverlap="1" wp14:anchorId="77361C77" wp14:editId="2BB738BB">
-                <wp:simplePos x="0" y="0"/>
-                <wp:positionH relativeFrom="column">
-                  <wp:posOffset>914430</wp:posOffset>
-                </wp:positionH>
-                <wp:positionV relativeFrom="paragraph">
-                  <wp:posOffset>1397380</wp:posOffset>
-                </wp:positionV>
-                <wp:extent cx="428760" cy="10080"/>
-                <wp:effectExtent l="38100" t="38100" r="47625" b="47625"/>
-                <wp:wrapNone/>
-                <wp:docPr id="413761044" name="Ink 5"/>
-                <wp:cNvGraphicFramePr/>
-                <a:graphic xmlns:a="http://schemas.openxmlformats.org/drawingml/2006/main">
-                  <a:graphicData uri="http://schemas.microsoft.com/office/word/2010/wordprocessingInk">
-                    <w14:contentPart bwMode="auto" r:id="rId8">
-                      <w14:nvContentPartPr>
-                        <w14:cNvContentPartPr/>
-                      </w14:nvContentPartPr>
-                      <w14:xfrm>
-                        <a:off x="0" y="0"/>
-                        <a:ext cx="428760" cy="10080"/>
-                      </w14:xfrm>
-                    </w14:contentPart>
-                  </a:graphicData>
-                </a:graphic>
-              </wp:anchor>
-            </w:drawing>
-          </mc:Choice>
-          <mc:Fallback>
-            <w:pict>
-              <v:shapetype w14:anchorId="3F008B7E" id="_x0000_t75" coordsize="21600,21600" o:spt="75" o:preferrelative="t" path="m@4@5l@4@11@9@11@9@5xe" filled="f" stroked="f">
-                <v:stroke joinstyle="miter"/>
-                <v:formulas>
-                  <v:f eqn="if lineDrawn pixelLineWidth 0"/>
-                  <v:f eqn="sum @0 1 0"/>
-                  <v:f eqn="sum 0 0 @1"/>
-                  <v:f eqn="prod @2 1 2"/>
-                  <v:f eqn="prod @3 21600 pixelWidth"/>
-                  <v:f eqn="prod @3 21600 pixelHeight"/>
-                  <v:f eqn="sum @0 0 1"/>
-                  <v:f eqn="prod @6 1 2"/>
-                  <v:f eqn="prod @7 21600 pixelWidth"/>
-                  <v:f eqn="sum @8 21600 0"/>
-                  <v:f eqn="prod @7 21600 pixelHeight"/>
-                  <v:f eqn="sum @10 21600 0"/>
-                </v:formulas>
-                <v:path o:extrusionok="f" gradientshapeok="t" o:connecttype="rect"/>
-                <o:lock v:ext="edit" aspectratio="t"/>
-              </v:shapetype>
-              <v:shape id="Ink 5" o:spid="_x0000_s1026" type="#_x0000_t75" style="position:absolute;margin-left:71.5pt;margin-top:109.55pt;width:34.7pt;height:1.8pt;z-index:251660288;visibility:visible;mso-wrap-style:square;mso-wrap-distance-left:9pt;mso-wrap-distance-top:0;mso-wrap-distance-right:9pt;mso-wrap-distance-bottom:0;mso-position-horizontal:absolute;mso-position-horizontal-relative:text;mso-position-vertical:absolute;mso-position-vertical-relative:text" o:gfxdata="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">
-                <v:imagedata r:id="rId10" o:title=""/>
-              </v:shape>
-            </w:pict>
-          </mc:Fallback>
-        </mc:AlternateContent>
-      </w:r>
-      <w:r>
-        <w:rPr>
-          <w:noProof/>
-        </w:rPr>
         <w:drawing>
-          <wp:inline distT="0" distB="0" distL="0" distR="0" wp14:anchorId="5AA61BCE" wp14:editId="1BB1781D">
-            <wp:extent cx="5943600" cy="1984375"/>
+          <wp:inline distT="0" distB="0" distL="0" distR="0" wp14:anchorId="6F8DFAD0" wp14:editId="46F26DA1">
+            <wp:extent cx="5943600" cy="3676650"/>
             <wp:effectExtent l="0" t="0" r="0" b="0"/>
-            <wp:docPr id="301839402" name="Picture 1" descr="A screenshot of a computer&#10;&#10;AI-generated content may be incorrect."/>
+            <wp:docPr id="1803565321" name="Picture 1"/>
             <wp:cNvGraphicFramePr>
               <a:graphicFrameLocks xmlns:a="http://schemas.openxmlformats.org/drawingml/2006/main" noChangeAspect="1"/>
             </wp:cNvGraphicFramePr>
@@ -851,11 +1057,11 @@
               <a:graphicData uri="http://schemas.openxmlformats.org/drawingml/2006/picture">
                 <pic:pic xmlns:pic="http://schemas.openxmlformats.org/drawingml/2006/picture">
                   <pic:nvPicPr>
-                    <pic:cNvPr id="301839402" name="Picture 1" descr="A screenshot of a computer&#10;&#10;AI-generated content may be incorrect."/>
+                    <pic:cNvPr id="1803565321" name="Picture 1803565321"/>
                     <pic:cNvPicPr/>
                   </pic:nvPicPr>
                   <pic:blipFill>
-                    <a:blip r:embed="rId11" cstate="print">
+                    <a:blip r:embed="rId14">
                       <a:extLst>
                         <a:ext uri="{28A0092B-C50C-407E-A947-70E740481C1C}">
                           <a14:useLocalDpi xmlns:a14="http://schemas.microsoft.com/office/drawing/2010/main" val="0"/>
@@ -869,7 +1075,7 @@
                   <pic:spPr>
                     <a:xfrm>
                       <a:off x="0" y="0"/>
-                      <a:ext cx="5943600" cy="1984375"/>
+                      <a:ext cx="5943600" cy="3676650"/>
                     </a:xfrm>
                     <a:prstGeom prst="rect">
                       <a:avLst/>
@@ -884,8 +1090,41 @@
     </w:p>
     <w:p>
       <w:r>
+        <w:t xml:space="preserve">A2WP should always be required at the top of the script because this allows your script to access a2wp.js. Likewise, module.exports should </w:t>
+      </w:r>
+      <w:r>
+        <w:t xml:space="preserve">always pass your new A2WP object at the bottom of the script so the rest of the Function App can read it. </w:t>
+      </w:r>
+    </w:p>
+    <w:p>
+      <w:r>
+        <w:t xml:space="preserve">The </w:t>
+      </w:r>
+      <w:r>
+        <w:rPr>
+          <w:b/>
+          <w:bCs/>
+        </w:rPr>
+        <w:t>msg</w:t>
+      </w:r>
+      <w:r>
+        <w:t xml:space="preserve"> variable is not necessary, but it’s encouraged because it prints what’s happening to the log and helps with debugging.</w:t>
+      </w:r>
+    </w:p>
+    <w:p>
+      <w:r>
         <w:lastRenderedPageBreak/>
-        <w:t>Image of functions.php script</w:t>
+        <w:t xml:space="preserve">Next, let’s add a function. Say you only want to post </w:t>
+      </w:r>
+      <w:r>
+        <w:rPr>
+          <w:i/>
+          <w:iCs/>
+        </w:rPr>
+        <w:t>free</w:t>
+      </w:r>
+      <w:r>
+        <w:t xml:space="preserve"> activities to WP. The script would check the price of each available Amilia item and decide whether or not it fits the “free” description. </w:t>
       </w:r>
     </w:p>
     <w:p>
@@ -894,10 +1133,10 @@
           <w:noProof/>
         </w:rPr>
         <w:drawing>
-          <wp:inline distT="0" distB="0" distL="0" distR="0" wp14:anchorId="4979A64E" wp14:editId="35C8CE71">
-            <wp:extent cx="3324225" cy="2415035"/>
-            <wp:effectExtent l="0" t="0" r="0" b="4445"/>
-            <wp:docPr id="2126565621" name="Picture 2" descr="A screenshot of a computer program&#10;&#10;AI-generated content may be incorrect."/>
+          <wp:inline distT="0" distB="0" distL="0" distR="0" wp14:anchorId="54EB80AE" wp14:editId="25D45C52">
+            <wp:extent cx="5943600" cy="5379085"/>
+            <wp:effectExtent l="0" t="0" r="0" b="0"/>
+            <wp:docPr id="2047627310" name="Picture 3" descr="A computer screen shot of a program code&#10;&#10;AI-generated content may be incorrect."/>
             <wp:cNvGraphicFramePr>
               <a:graphicFrameLocks xmlns:a="http://schemas.openxmlformats.org/drawingml/2006/main" noChangeAspect="1"/>
             </wp:cNvGraphicFramePr>
@@ -905,11 +1144,11 @@
               <a:graphicData uri="http://schemas.openxmlformats.org/drawingml/2006/picture">
                 <pic:pic xmlns:pic="http://schemas.openxmlformats.org/drawingml/2006/picture">
                   <pic:nvPicPr>
-                    <pic:cNvPr id="2126565621" name="Picture 2" descr="A screenshot of a computer program&#10;&#10;AI-generated content may be incorrect."/>
+                    <pic:cNvPr id="2047627310" name="Picture 3" descr="A computer screen shot of a program code&#10;&#10;AI-generated content may be incorrect."/>
                     <pic:cNvPicPr/>
                   </pic:nvPicPr>
                   <pic:blipFill>
-                    <a:blip r:embed="rId12">
+                    <a:blip r:embed="rId15">
                       <a:extLst>
                         <a:ext uri="{28A0092B-C50C-407E-A947-70E740481C1C}">
                           <a14:useLocalDpi xmlns:a14="http://schemas.microsoft.com/office/drawing/2010/main" val="0"/>
@@ -923,7 +1162,7 @@
                   <pic:spPr>
                     <a:xfrm>
                       <a:off x="0" y="0"/>
-                      <a:ext cx="3333451" cy="2421737"/>
+                      <a:ext cx="5943600" cy="5379085"/>
                     </a:xfrm>
                     <a:prstGeom prst="rect">
                       <a:avLst/>
@@ -936,10 +1175,67 @@
         </w:drawing>
       </w:r>
     </w:p>
-    <w:p/>
-    <w:p>
-      <w:r>
-        <w:t>Example of CDATA as seen in “view page source”</w:t>
+    <w:p>
+      <w:r>
+        <w:rPr>
+          <w:b/>
+          <w:bCs/>
+        </w:rPr>
+        <w:t xml:space="preserve">Every custom function must pass </w:t>
+      </w:r>
+      <w:r>
+        <w:rPr>
+          <w:b/>
+          <w:bCs/>
+          <w:u w:val="single"/>
+        </w:rPr>
+        <w:t>input</w:t>
+      </w:r>
+      <w:r>
+        <w:rPr>
+          <w:b/>
+          <w:bCs/>
+        </w:rPr>
+        <w:t xml:space="preserve"> as a parameter and must return input.</w:t>
+      </w:r>
+      <w:r>
+        <w:t xml:space="preserve"> </w:t>
+      </w:r>
+      <w:r>
+        <w:t>Input is carried throughout all custom functions. If you want to add more values to input, just write</w:t>
+      </w:r>
+      <w:r>
+        <w:t xml:space="preserve"> something like</w:t>
+      </w:r>
+      <w:r>
+        <w:t xml:space="preserve"> input.newVar = “something” and the next function will be able to access it. </w:t>
+      </w:r>
+    </w:p>
+    <w:p>
+      <w:r>
+        <w:rPr>
+          <w:b/>
+          <w:bCs/>
+        </w:rPr>
+        <w:t>objPost</w:t>
+      </w:r>
+      <w:r>
+        <w:t xml:space="preserve"> and</w:t>
+      </w:r>
+      <w:r>
+        <w:rPr>
+          <w:b/>
+          <w:bCs/>
+        </w:rPr>
+        <w:t xml:space="preserve"> objDel</w:t>
+      </w:r>
+      <w:r>
+        <w:t xml:space="preserve"> are the first two arrays to exist in input, and even though the class automatically generates content for them, you can also tamper with these values if you want to add/remove items from either array. </w:t>
+      </w:r>
+    </w:p>
+    <w:p>
+      <w:r>
+        <w:t xml:space="preserve">Now you’ll need to build the actual content going to WP. </w:t>
       </w:r>
     </w:p>
     <w:p>
@@ -947,11 +1243,12 @@
         <w:rPr>
           <w:noProof/>
         </w:rPr>
+        <w:lastRenderedPageBreak/>
         <w:drawing>
-          <wp:inline distT="0" distB="0" distL="0" distR="0" wp14:anchorId="5B71CFCE" wp14:editId="0A4A2B26">
-            <wp:extent cx="5943600" cy="1130300"/>
-            <wp:effectExtent l="0" t="0" r="0" b="0"/>
-            <wp:docPr id="1937184826" name="Picture 3" descr="A computer screen shot of a computer code&#10;&#10;AI-generated content may be incorrect."/>
+          <wp:inline distT="0" distB="0" distL="0" distR="0" wp14:anchorId="223EAAD3" wp14:editId="5A1A8231">
+            <wp:extent cx="5943600" cy="5306060"/>
+            <wp:effectExtent l="0" t="0" r="0" b="8890"/>
+            <wp:docPr id="766024546" name="Picture 6" descr="A computer screen shot of a program code&#10;&#10;AI-generated content may be incorrect."/>
             <wp:cNvGraphicFramePr>
               <a:graphicFrameLocks xmlns:a="http://schemas.openxmlformats.org/drawingml/2006/main" noChangeAspect="1"/>
             </wp:cNvGraphicFramePr>
@@ -959,11 +1256,11 @@
               <a:graphicData uri="http://schemas.openxmlformats.org/drawingml/2006/picture">
                 <pic:pic xmlns:pic="http://schemas.openxmlformats.org/drawingml/2006/picture">
                   <pic:nvPicPr>
-                    <pic:cNvPr id="1937184826" name="Picture 3" descr="A computer screen shot of a computer code&#10;&#10;AI-generated content may be incorrect."/>
+                    <pic:cNvPr id="766024546" name="Picture 6" descr="A computer screen shot of a program code&#10;&#10;AI-generated content may be incorrect."/>
                     <pic:cNvPicPr/>
                   </pic:nvPicPr>
                   <pic:blipFill>
-                    <a:blip r:embed="rId13">
+                    <a:blip r:embed="rId16">
                       <a:extLst>
                         <a:ext uri="{28A0092B-C50C-407E-A947-70E740481C1C}">
                           <a14:useLocalDpi xmlns:a14="http://schemas.microsoft.com/office/drawing/2010/main" val="0"/>
@@ -977,7 +1274,7 @@
                   <pic:spPr>
                     <a:xfrm>
                       <a:off x="0" y="0"/>
-                      <a:ext cx="5943600" cy="1130300"/>
+                      <a:ext cx="5943600" cy="5306060"/>
                     </a:xfrm>
                     <a:prstGeom prst="rect">
                       <a:avLst/>
@@ -991,226 +1288,57 @@
       </w:r>
     </w:p>
     <w:p>
-      <w:pPr>
-        <w:pBdr>
-          <w:bottom w:val="single" w:sz="4" w:space="1" w:color="auto"/>
-        </w:pBdr>
-      </w:pPr>
-    </w:p>
-    <w:p>
-      <w:bookmarkStart w:id="3" w:name="Endpoints"/>
-    </w:p>
-    <w:p>
-      <w:pPr>
+      <w:r>
+        <w:t>Add all WP attributes to bodyData (</w:t>
+      </w:r>
+      <w:r>
         <w:rPr>
           <w:b/>
           <w:bCs/>
         </w:rPr>
-      </w:pPr>
+        <w:t>title</w:t>
+      </w:r>
+      <w:r>
+        <w:t xml:space="preserve">, </w:t>
+      </w:r>
       <w:r>
         <w:rPr>
           <w:b/>
           <w:bCs/>
         </w:rPr>
-        <w:t>ENDPOINTS AND URLS</w:t>
-      </w:r>
-    </w:p>
-    <w:bookmarkEnd w:id="3"/>
-    <w:p>
-      <w:r>
-        <w:t xml:space="preserve">Amilia URL: </w:t>
-      </w:r>
-      <w:hyperlink r:id="rId14" w:history="1">
-        <w:r>
-          <w:rPr>
-            <w:rStyle w:val="Hyperlink"/>
-          </w:rPr>
-          <w:t>https://amilia-img-proxy.azurewebsites.net/api/GetAmilia</w:t>
-        </w:r>
-      </w:hyperlink>
-      <w:r>
-        <w:t xml:space="preserve"> </w:t>
-      </w:r>
-    </w:p>
-    <w:p>
-      <w:r>
-        <w:t xml:space="preserve">Endpoints: </w:t>
-      </w:r>
-    </w:p>
-    <w:p>
-      <w:r>
-        <w:t xml:space="preserve">GET / POST </w:t>
-      </w:r>
-      <w:r>
-        <w:sym w:font="Wingdings" w:char="F0E0"/>
-      </w:r>
-      <w:r>
-        <w:t xml:space="preserve"> </w:t>
-      </w:r>
-      <w:r>
-        <w:t xml:space="preserve">activities </w:t>
-      </w:r>
-    </w:p>
-    <w:p/>
-    <w:p>
-      <w:r>
-        <w:t xml:space="preserve">WordPress REST URL: </w:t>
-      </w:r>
-      <w:hyperlink r:id="rId15" w:history="1">
-        <w:r>
-          <w:rPr>
-            <w:rStyle w:val="Hyperlink"/>
-          </w:rPr>
-          <w:t>https://sbvpastg.wpenginepowered.com/wp-json/wp/v2/</w:t>
-        </w:r>
-      </w:hyperlink>
-      <w:r>
-        <w:t xml:space="preserve"> </w:t>
-      </w:r>
-    </w:p>
-    <w:p>
-      <w:r>
-        <w:t>Endpoints</w:t>
-      </w:r>
-      <w:r>
-        <w:t xml:space="preserve">: </w:t>
-      </w:r>
-    </w:p>
-    <w:p>
-      <w:r>
-        <w:t xml:space="preserve">GET </w:t>
-      </w:r>
-      <w:r>
-        <w:sym w:font="Wingdings" w:char="F0E0"/>
-      </w:r>
-      <w:r>
-        <w:t xml:space="preserve"> activities</w:t>
-      </w:r>
-    </w:p>
-    <w:p>
-      <w:r>
-        <w:t xml:space="preserve">POST </w:t>
-      </w:r>
-      <w:r>
-        <w:sym w:font="Wingdings" w:char="F0E0"/>
-      </w:r>
-      <w:r>
-        <w:t xml:space="preserve"> activities?slug=activities-{id}</w:t>
-      </w:r>
-    </w:p>
-    <w:p>
-      <w:r>
-        <w:lastRenderedPageBreak/>
-        <w:t xml:space="preserve">POST </w:t>
-      </w:r>
-      <w:r>
-        <w:sym w:font="Wingdings" w:char="F0E0"/>
-      </w:r>
-      <w:r>
-        <w:t xml:space="preserve"> media</w:t>
-      </w:r>
-    </w:p>
-    <w:p/>
-    <w:p>
-      <w:r>
-        <w:t xml:space="preserve">GetImg proxy URL: </w:t>
-      </w:r>
-      <w:hyperlink r:id="rId16" w:history="1">
-        <w:r>
-          <w:rPr>
-            <w:rStyle w:val="Hyperlink"/>
-          </w:rPr>
-          <w:t>https://amilia-img-proxy.azurewebsites.net/api/GetImg</w:t>
-        </w:r>
-      </w:hyperlink>
-      <w:r>
-        <w:t xml:space="preserve"> </w:t>
-      </w:r>
-    </w:p>
-    <w:p>
-      <w:pPr>
-        <w:pBdr>
-          <w:bottom w:val="single" w:sz="4" w:space="1" w:color="auto"/>
-        </w:pBdr>
-      </w:pPr>
-    </w:p>
-    <w:p/>
-    <w:p>
-      <w:pPr>
+        <w:t>status</w:t>
+      </w:r>
+      <w:r>
+        <w:t xml:space="preserve">, and </w:t>
+      </w:r>
+      <w:r>
         <w:rPr>
           <w:b/>
           <w:bCs/>
         </w:rPr>
-      </w:pPr>
-      <w:bookmarkStart w:id="4" w:name="Proxies"/>
-      <w:r>
-        <w:rPr>
-          <w:b/>
-          <w:bCs/>
-        </w:rPr>
-        <w:t>PROXIES</w:t>
-      </w:r>
-    </w:p>
-    <w:bookmarkEnd w:id="4"/>
-    <w:p>
-      <w:r>
-        <w:t>Add later</w:t>
-      </w:r>
-    </w:p>
-    <w:p>
-      <w:pPr>
-        <w:pBdr>
-          <w:bottom w:val="single" w:sz="4" w:space="1" w:color="auto"/>
-        </w:pBdr>
-      </w:pPr>
-    </w:p>
-    <w:p/>
-    <w:p>
-      <w:pPr>
-        <w:rPr>
-          <w:b/>
-          <w:bCs/>
-        </w:rPr>
-      </w:pPr>
-      <w:bookmarkStart w:id="5" w:name="Templates"/>
-      <w:r>
-        <w:rPr>
-          <w:b/>
-          <w:bCs/>
-        </w:rPr>
-        <w:t>ADDING/EDITING HTML TEMPLATES</w:t>
-      </w:r>
-    </w:p>
-    <w:p>
-      <w:pPr>
-        <w:rPr>
-          <w:b/>
-          <w:bCs/>
-        </w:rPr>
-      </w:pPr>
-      <w:r>
-        <w:rPr>
-          <w:b/>
-          <w:bCs/>
-        </w:rPr>
-        <w:t>(Not using HTML template anymore! Will remove this section maybe)</w:t>
-      </w:r>
-    </w:p>
-    <w:bookmarkEnd w:id="5"/>
-    <w:p>
-      <w:r>
-        <w:t xml:space="preserve">HTML </w:t>
-      </w:r>
-      <w:r>
-        <w:t xml:space="preserve">templates are important to the script because they are the markup that will go directly into the WP editor box when creating a new post. </w:t>
-      </w:r>
-    </w:p>
-    <w:p>
-      <w:r>
-        <w:t xml:space="preserve">A2WP already has one template in the WP File Manager (wp-content/themes/sbvpa/html/). </w:t>
-      </w:r>
-      <w:r>
-        <w:t xml:space="preserve">Here’s a snippet of it. </w:t>
+        <w:t>amilia_id</w:t>
+      </w:r>
+      <w:r>
+        <w:t xml:space="preserve"> are required). </w:t>
+      </w:r>
+    </w:p>
+    <w:p>
+      <w:r>
+        <w:rPr>
+          <w:u w:val="single"/>
+        </w:rPr>
+        <w:t>All your content must be passed in a variable named “bodyData” otherwise it will not carry over.</w:t>
+      </w:r>
+    </w:p>
+    <w:p>
+      <w:r>
+        <w:t>F</w:t>
+      </w:r>
+      <w:r>
+        <w:t>inally, call the new object</w:t>
+      </w:r>
+      <w:r>
+        <w:t>.</w:t>
       </w:r>
     </w:p>
     <w:p>
@@ -1219,10 +1347,10 @@
           <w:noProof/>
         </w:rPr>
         <w:drawing>
-          <wp:inline distT="0" distB="0" distL="0" distR="0" wp14:anchorId="1DF632F4" wp14:editId="30667F44">
-            <wp:extent cx="3276600" cy="2339479"/>
-            <wp:effectExtent l="0" t="0" r="0" b="3810"/>
-            <wp:docPr id="2086926097" name="Picture 1" descr="A screen shot of a computer program&#10;&#10;AI-generated content may be incorrect."/>
+          <wp:inline distT="0" distB="0" distL="0" distR="0" wp14:anchorId="58FA4AC2" wp14:editId="6A10D08C">
+            <wp:extent cx="4143953" cy="790685"/>
+            <wp:effectExtent l="0" t="0" r="9525" b="9525"/>
+            <wp:docPr id="2024139403" name="Picture 7" descr="A screenshot of a computer program&#10;&#10;AI-generated content may be incorrect."/>
             <wp:cNvGraphicFramePr>
               <a:graphicFrameLocks xmlns:a="http://schemas.openxmlformats.org/drawingml/2006/main" noChangeAspect="1"/>
             </wp:cNvGraphicFramePr>
@@ -1230,7 +1358,7 @@
               <a:graphicData uri="http://schemas.openxmlformats.org/drawingml/2006/picture">
                 <pic:pic xmlns:pic="http://schemas.openxmlformats.org/drawingml/2006/picture">
                   <pic:nvPicPr>
-                    <pic:cNvPr id="2086926097" name="Picture 1" descr="A screen shot of a computer program&#10;&#10;AI-generated content may be incorrect."/>
+                    <pic:cNvPr id="2024139403" name="Picture 7" descr="A screenshot of a computer program&#10;&#10;AI-generated content may be incorrect."/>
                     <pic:cNvPicPr/>
                   </pic:nvPicPr>
                   <pic:blipFill>
@@ -1248,7 +1376,7 @@
                   <pic:spPr>
                     <a:xfrm>
                       <a:off x="0" y="0"/>
-                      <a:ext cx="3304291" cy="2359250"/>
+                      <a:ext cx="4143953" cy="790685"/>
                     </a:xfrm>
                     <a:prstGeom prst="rect">
                       <a:avLst/>
@@ -1261,438 +1389,14 @@
         </w:drawing>
       </w:r>
     </w:p>
-    <w:p>
-      <w:r>
-        <w:t xml:space="preserve">A2WP’s DOM parser reads the ids so it knows where to insert what information. </w:t>
-      </w:r>
-      <w:r>
-        <w:t xml:space="preserve">The ids are not for styling purposes – </w:t>
-      </w:r>
-      <w:r>
-        <w:rPr>
-          <w:b/>
-          <w:bCs/>
-        </w:rPr>
-        <w:t>please do not remove them</w:t>
-      </w:r>
-      <w:r>
-        <w:t>. You can change the format, tags, placement, etc. of all the markup</w:t>
-      </w:r>
-      <w:r>
-        <w:t xml:space="preserve"> (you can add more classes and ids, too)</w:t>
-      </w:r>
-      <w:r>
-        <w:t xml:space="preserve">, </w:t>
-      </w:r>
-      <w:r>
-        <w:t xml:space="preserve">but the appropriate id must be inside the appropriate tag. </w:t>
-      </w:r>
-    </w:p>
-    <w:p>
-      <w:r>
-        <w:lastRenderedPageBreak/>
-        <w:t xml:space="preserve">For instance, if you want the schedule summary to be a &lt;p&gt; at the top of the page instead of a list element in the sidebar, just remember to include id=“amilia-wp-activity-schedule-summary” in &lt;p&gt; tag. </w:t>
-      </w:r>
-    </w:p>
-    <w:p>
-      <w:r>
-        <w:t xml:space="preserve">You can also create a new HTML template in the same location as activity-template.html, create a new updateDOM function in the A2WP class, and then reference both when you call your object. </w:t>
-      </w:r>
-    </w:p>
-    <w:p>
-      <w:pPr>
-        <w:pBdr>
-          <w:bottom w:val="single" w:sz="4" w:space="1" w:color="auto"/>
-        </w:pBdr>
-        <w:rPr>
-          <w:b/>
-          <w:bCs/>
-        </w:rPr>
-      </w:pPr>
-    </w:p>
-    <w:p>
-      <w:pPr>
-        <w:rPr>
-          <w:b/>
-          <w:bCs/>
-        </w:rPr>
-      </w:pPr>
-    </w:p>
-    <w:p>
-      <w:pPr>
-        <w:rPr>
-          <w:b/>
-          <w:bCs/>
-        </w:rPr>
-      </w:pPr>
-      <w:bookmarkStart w:id="6" w:name="CustomFunctions"/>
-      <w:r>
-        <w:rPr>
-          <w:b/>
-          <w:bCs/>
-        </w:rPr>
-        <w:t>ADDING CUSTOM FUNCTIONS</w:t>
-      </w:r>
-    </w:p>
-    <w:bookmarkEnd w:id="6"/>
-    <w:p>
-      <w:r>
-        <w:t xml:space="preserve">Custom functions are declared and then assigned to an A2WP object. Each function runs in the order they are added. The purpose here is to manipulate Amilia and WP data in order to post something to WP. </w:t>
-      </w:r>
-    </w:p>
-    <w:p>
-      <w:r>
-        <w:t xml:space="preserve">To edit </w:t>
-      </w:r>
-      <w:r>
-        <w:t>or create your own object</w:t>
-      </w:r>
-      <w:r>
-        <w:t xml:space="preserve">, </w:t>
-      </w:r>
-      <w:r>
-        <w:t xml:space="preserve">you can download the script from </w:t>
-      </w:r>
-      <w:r>
-        <w:t>WP File Manager here: wp-content/themes/sbvpa/js/</w:t>
-      </w:r>
-      <w:r>
-        <w:t>call-</w:t>
-      </w:r>
-      <w:r>
-        <w:t>a2wp.js</w:t>
-      </w:r>
-    </w:p>
-    <w:p>
-      <w:r>
-        <w:t>Scroll down to the bottom of the script until you reach “Call your objects here.” Here,</w:t>
-      </w:r>
-      <w:r>
-        <w:t xml:space="preserve"> write</w:t>
-      </w:r>
-      <w:r>
-        <w:t xml:space="preserve"> a new instance of A2WP and pass the </w:t>
-      </w:r>
-      <w:r>
-        <w:t xml:space="preserve">following </w:t>
-      </w:r>
-      <w:r>
-        <w:t>arguments</w:t>
-      </w:r>
-      <w:r>
-        <w:t xml:space="preserve">: </w:t>
-      </w:r>
-    </w:p>
-    <w:p>
-      <w:pPr>
-        <w:pStyle w:val="ListParagraph"/>
-        <w:numPr>
-          <w:ilvl w:val="0"/>
-          <w:numId w:val="1"/>
-        </w:numPr>
-      </w:pPr>
-      <w:r>
-        <w:t xml:space="preserve">amilia </w:t>
-      </w:r>
-    </w:p>
-    <w:p>
-      <w:pPr>
-        <w:pStyle w:val="ListParagraph"/>
-        <w:numPr>
-          <w:ilvl w:val="1"/>
-          <w:numId w:val="1"/>
-        </w:numPr>
-      </w:pPr>
-      <w:r>
-        <w:t>The endpoint and args used to GET Amilia data</w:t>
-      </w:r>
-      <w:r>
-        <w:t>.</w:t>
-      </w:r>
-    </w:p>
-    <w:p>
-      <w:pPr>
-        <w:pStyle w:val="ListParagraph"/>
-        <w:numPr>
-          <w:ilvl w:val="0"/>
-          <w:numId w:val="1"/>
-        </w:numPr>
-      </w:pPr>
-      <w:r>
-        <w:t xml:space="preserve">wp </w:t>
-      </w:r>
-    </w:p>
-    <w:p>
-      <w:pPr>
-        <w:pStyle w:val="ListParagraph"/>
-        <w:numPr>
-          <w:ilvl w:val="1"/>
-          <w:numId w:val="1"/>
-        </w:numPr>
-      </w:pPr>
-      <w:r>
-        <w:t>The endpoint and args used to GET or POST WP data</w:t>
-      </w:r>
-      <w:r>
-        <w:t>.</w:t>
-      </w:r>
-    </w:p>
-    <w:p>
-      <w:pPr>
-        <w:pStyle w:val="ListParagraph"/>
-        <w:numPr>
-          <w:ilvl w:val="0"/>
-          <w:numId w:val="1"/>
-        </w:numPr>
-      </w:pPr>
-      <w:r>
-        <w:t xml:space="preserve">targetPath </w:t>
-      </w:r>
-    </w:p>
-    <w:p>
-      <w:pPr>
-        <w:pStyle w:val="ListParagraph"/>
-        <w:numPr>
-          <w:ilvl w:val="1"/>
-          <w:numId w:val="1"/>
-        </w:numPr>
-      </w:pPr>
-      <w:r>
-        <w:t xml:space="preserve">A variable that tells the script where to run so it doesn’t run when someone loads a completely unrelated page on SBVPA. </w:t>
-      </w:r>
-    </w:p>
-    <w:p>
-      <w:pPr>
-        <w:pStyle w:val="ListParagraph"/>
-        <w:numPr>
-          <w:ilvl w:val="1"/>
-          <w:numId w:val="1"/>
-        </w:numPr>
-      </w:pPr>
-      <w:r>
-        <w:t xml:space="preserve">A target path may look like this: </w:t>
-      </w:r>
-      <w:r>
-        <w:t>"/things-to-do/"</w:t>
-      </w:r>
-    </w:p>
-    <w:p>
-      <w:pPr>
-        <w:pStyle w:val="ListParagraph"/>
-        <w:numPr>
-          <w:ilvl w:val="1"/>
-          <w:numId w:val="1"/>
-        </w:numPr>
-      </w:pPr>
-      <w:r>
-        <w:t xml:space="preserve">If you want the script to run only when a slug exists after the parent, the target path will look like this: </w:t>
-      </w:r>
-      <w:r>
-        <w:t>"/things-to-do/</w:t>
-      </w:r>
-      <w:r>
-        <w:t>{path}</w:t>
-      </w:r>
-      <w:r>
-        <w:t>"</w:t>
-      </w:r>
-    </w:p>
-    <w:p>
-      <w:pPr>
-        <w:pStyle w:val="ListParagraph"/>
-        <w:numPr>
-          <w:ilvl w:val="1"/>
-          <w:numId w:val="1"/>
-        </w:numPr>
-      </w:pPr>
-      <w:r>
-        <w:t xml:space="preserve">If the slug is optional, the target path will look like this: </w:t>
-      </w:r>
-      <w:r>
-        <w:t>"/things-to-do/</w:t>
-      </w:r>
-      <w:r>
-        <w:t>{path?}</w:t>
-      </w:r>
-      <w:r>
-        <w:t>"</w:t>
-      </w:r>
-    </w:p>
-    <w:p>
-      <w:pPr>
-        <w:pStyle w:val="ListParagraph"/>
-        <w:numPr>
-          <w:ilvl w:val="0"/>
-          <w:numId w:val="1"/>
-        </w:numPr>
-      </w:pPr>
-      <w:r>
-        <w:t>templatePath</w:t>
-      </w:r>
-      <w:r>
-        <w:t xml:space="preserve"> </w:t>
-      </w:r>
-    </w:p>
-    <w:p>
-      <w:pPr>
-        <w:pStyle w:val="ListParagraph"/>
-        <w:numPr>
-          <w:ilvl w:val="1"/>
-          <w:numId w:val="1"/>
-        </w:numPr>
-      </w:pPr>
-      <w:r>
-        <w:t xml:space="preserve">The path to your template, which ideally exists in WP File Manager. However, if it doesn’t, you don’t need to prepend apiData to your path file. </w:t>
-      </w:r>
-    </w:p>
-    <w:p>
-      <w:pPr>
-        <w:pStyle w:val="ListParagraph"/>
-        <w:numPr>
-          <w:ilvl w:val="0"/>
-          <w:numId w:val="1"/>
-        </w:numPr>
-      </w:pPr>
-      <w:r>
-        <w:t>categories</w:t>
-      </w:r>
-    </w:p>
-    <w:p>
-      <w:pPr>
-        <w:pStyle w:val="ListParagraph"/>
-        <w:numPr>
-          <w:ilvl w:val="1"/>
-          <w:numId w:val="1"/>
-        </w:numPr>
-      </w:pPr>
-      <w:r>
-        <w:t>JSON that links specific variables to category ids.</w:t>
-      </w:r>
-    </w:p>
-    <w:p>
-      <w:pPr>
-        <w:rPr>
-          <w:noProof/>
-        </w:rPr>
-      </w:pPr>
-      <w:r>
-        <w:lastRenderedPageBreak/>
-        <w:t>The new A2WP instantiation should look something like this.</w:t>
-      </w:r>
-    </w:p>
-    <w:p>
-      <w:r>
-        <w:rPr>
-          <w:noProof/>
-        </w:rPr>
-        <w:drawing>
-          <wp:inline distT="0" distB="0" distL="0" distR="0" wp14:anchorId="69FB00D3" wp14:editId="1D70B89A">
-            <wp:extent cx="5353797" cy="3029373"/>
-            <wp:effectExtent l="0" t="0" r="0" b="0"/>
-            <wp:docPr id="272060528" name="Picture 1" descr="A screen shot of a computer code&#10;&#10;AI-generated content may be incorrect."/>
-            <wp:cNvGraphicFramePr>
-              <a:graphicFrameLocks xmlns:a="http://schemas.openxmlformats.org/drawingml/2006/main" noChangeAspect="1"/>
-            </wp:cNvGraphicFramePr>
-            <a:graphic xmlns:a="http://schemas.openxmlformats.org/drawingml/2006/main">
-              <a:graphicData uri="http://schemas.openxmlformats.org/drawingml/2006/picture">
-                <pic:pic xmlns:pic="http://schemas.openxmlformats.org/drawingml/2006/picture">
-                  <pic:nvPicPr>
-                    <pic:cNvPr id="272060528" name="Picture 1" descr="A screen shot of a computer code&#10;&#10;AI-generated content may be incorrect."/>
-                    <pic:cNvPicPr/>
-                  </pic:nvPicPr>
-                  <pic:blipFill>
-                    <a:blip r:embed="rId18">
-                      <a:extLst>
-                        <a:ext uri="{28A0092B-C50C-407E-A947-70E740481C1C}">
-                          <a14:useLocalDpi xmlns:a14="http://schemas.microsoft.com/office/drawing/2010/main" val="0"/>
-                        </a:ext>
-                      </a:extLst>
-                    </a:blip>
-                    <a:stretch>
-                      <a:fillRect/>
-                    </a:stretch>
-                  </pic:blipFill>
-                  <pic:spPr>
-                    <a:xfrm>
-                      <a:off x="0" y="0"/>
-                      <a:ext cx="5353797" cy="3029373"/>
-                    </a:xfrm>
-                    <a:prstGeom prst="rect">
-                      <a:avLst/>
-                    </a:prstGeom>
-                  </pic:spPr>
-                </pic:pic>
-              </a:graphicData>
-            </a:graphic>
-          </wp:inline>
-        </w:drawing>
-      </w:r>
-    </w:p>
     <w:p/>
     <w:p>
       <w:r>
-        <w:t xml:space="preserve">The addFunc calls here are taking custom functions and passing them into the object. They will run in the order passed, so in the example above, they go </w:t>
-      </w:r>
-      <w:r>
-        <w:rPr>
-          <w:b/>
-          <w:bCs/>
-        </w:rPr>
-        <w:t xml:space="preserve">getId </w:t>
-      </w:r>
-      <w:r>
-        <w:rPr>
-          <w:b/>
-          <w:bCs/>
-        </w:rPr>
-        <w:sym w:font="Wingdings" w:char="F0E0"/>
-      </w:r>
-      <w:r>
-        <w:rPr>
-          <w:b/>
-          <w:bCs/>
-        </w:rPr>
-        <w:t xml:space="preserve"> updateActDOM </w:t>
-      </w:r>
-      <w:r>
-        <w:rPr>
-          <w:b/>
-          <w:bCs/>
-        </w:rPr>
-        <w:sym w:font="Wingdings" w:char="F0E0"/>
-      </w:r>
-      <w:r>
-        <w:rPr>
-          <w:b/>
-          <w:bCs/>
-        </w:rPr>
-        <w:t xml:space="preserve"> assignCats</w:t>
-      </w:r>
-      <w:r>
-        <w:t xml:space="preserve">. </w:t>
-      </w:r>
-    </w:p>
-    <w:p>
-      <w:r>
-        <w:t xml:space="preserve">Each custom function takes a parameter “input” (which is a JSON), adds to input (optional), and then returns input so it can be passed to the next </w:t>
-      </w:r>
-      <w:r>
-        <w:t xml:space="preserve">function. </w:t>
-      </w:r>
-    </w:p>
-    <w:p>
-      <w:r>
-        <w:t>Define your functions under “Make your custom functions here.”</w:t>
-      </w:r>
-    </w:p>
-    <w:p>
-      <w:r>
-        <w:t xml:space="preserve">Finally, run your new A2WP object with call(). </w:t>
-      </w:r>
-    </w:p>
-    <w:p/>
+        <w:t>Happy debugging! (Or not, if you’re lucky.)</w:t>
+      </w:r>
+    </w:p>
     <w:sectPr>
-      <w:headerReference w:type="default" r:id="rId19"/>
+      <w:headerReference w:type="default" r:id="rId18"/>
       <w:pgSz w:w="12240" w:h="15840"/>
       <w:pgMar w:top="1440" w:right="1440" w:bottom="1440" w:left="1440" w:header="720" w:footer="720" w:gutter="0"/>
       <w:cols w:space="720"/>
@@ -3310,34 +3014,6 @@
 </w:styles>
 </file>
 
-<file path=word/ink/ink1.xml><?xml version="1.0" encoding="utf-8"?>
-<inkml:ink xmlns:inkml="http://www.w3.org/2003/InkML">
-  <inkml:definitions>
-    <inkml:context xml:id="ctx0">
-      <inkml:inkSource xml:id="inkSrc0">
-        <inkml:traceFormat>
-          <inkml:channel name="X" type="integer" min="-2.14748E9" max="2.14748E9" units="cm"/>
-          <inkml:channel name="Y" type="integer" min="-2.14748E9" max="2.14748E9" units="cm"/>
-          <inkml:channel name="F" type="integer" max="32767" units="dev"/>
-        </inkml:traceFormat>
-        <inkml:channelProperties>
-          <inkml:channelProperty channel="X" name="resolution" value="1000" units="1/cm"/>
-          <inkml:channelProperty channel="Y" name="resolution" value="1000" units="1/cm"/>
-          <inkml:channelProperty channel="F" name="resolution" value="0" units="1/dev"/>
-        </inkml:channelProperties>
-      </inkml:inkSource>
-      <inkml:timestamp xml:id="ts0" timeString="2025-04-08T18:54:27.802"/>
-    </inkml:context>
-    <inkml:brush xml:id="br0">
-      <inkml:brushProperty name="width" value="0.035" units="cm"/>
-      <inkml:brushProperty name="height" value="0.035" units="cm"/>
-      <inkml:brushProperty name="color" value="#E71224"/>
-    </inkml:brush>
-  </inkml:definitions>
-  <inkml:trace contextRef="#ctx0" brushRef="#br0">0 27 24244,'1190'-27'0</inkml:trace>
-</inkml:ink>
-</file>
-
 <file path=word/theme/theme1.xml><?xml version="1.0" encoding="utf-8"?>
 <a:theme xmlns:a="http://schemas.openxmlformats.org/drawingml/2006/main" name="Office Theme">
   <a:themeElements>

</xml_diff>